<commit_message>
feat: add results table for free5GC paper's reachable UDR handlers
Table summarizing the 4 reachable handlers in api_datarepository.go
(HTTP verb, missing return count, patch outcome), sourced directly
from reports/reachability/free5gc_case_study.md. Recompiled clean,
still 3 pages. Regenerated main.docx to match.
</commit_message>
<xml_diff>
--- a/paper/main.docx
+++ b/paper/main.docx
@@ -586,9 +586,338 @@
         <w:t xml:space="preserve"> </w:t>
       </w:r>
       <w:r>
-        <w:t xml:space="preserve">pattern and classified as CWE-285, matching the real vulnerability class disclosed for this CVE family.</w:t>
-      </w:r>
-    </w:p>
+        <w:t xml:space="preserve">pattern and classified as CWE-285, matching the real vulnerability class disclosed for this CVE family. Table 1 lists the four handlers by name; all share the common prefix</w:t>
+      </w:r>
+      <w:r>
+        <w:t xml:space="preserve"> </w:t>
+      </w:r>
+      <w:r>
+        <w:rPr>
+          <w:rStyle w:val="VerbatimChar"/>
+        </w:rPr>
+        <w:t xml:space="preserve">HandleApplicationDataInfluenceDataSubsToNotify</w:t>
+      </w:r>
+      <w:r>
+        <w:t xml:space="preserve">, omitted below for space.</w:t>
+      </w:r>
+    </w:p>
+    <w:p>
+      <w:pPr>
+        <w:pStyle w:val="BodyText"/>
+      </w:pPr>
+      <w:r>
+        <w:rPr>
+          <w:b/>
+          <w:bCs/>
+        </w:rPr>
+        <w:t xml:space="preserve">Table 1: Reachable UDR handlers in</w:t>
+      </w:r>
+      <w:r>
+        <w:rPr>
+          <w:b/>
+          <w:bCs/>
+        </w:rPr>
+        <w:t xml:space="preserve"> </w:t>
+      </w:r>
+      <w:r>
+        <w:rPr>
+          <w:rStyle w:val="VerbatimChar"/>
+          <w:b/>
+          <w:bCs/>
+        </w:rPr>
+        <w:t xml:space="preserve">api_datarepository.go</w:t>
+      </w:r>
+      <w:r>
+        <w:rPr>
+          <w:b/>
+          <w:bCs/>
+        </w:rPr>
+        <w:t xml:space="preserve"> </w:t>
+      </w:r>
+      <w:r>
+        <w:rPr>
+          <w:b/>
+          <w:bCs/>
+        </w:rPr>
+        <w:t xml:space="preserve">and their patch outcome.</w:t>
+      </w:r>
+    </w:p>
+    <w:tbl>
+      <w:tblPr>
+        <w:tblStyle w:val="Table"/>
+        <w:tblW w:type="auto" w:w="0"/>
+        <w:tblLook w:firstRow="1" w:lastRow="0" w:firstColumn="0" w:lastColumn="0" w:noHBand="0" w:noVBand="0" w:val="0020"/>
+      </w:tblPr>
+      <w:tblGrid>
+        <w:gridCol w:w="1980"/>
+        <w:gridCol w:w="1980"/>
+        <w:gridCol w:w="1980"/>
+        <w:gridCol w:w="1980"/>
+      </w:tblGrid>
+      <w:tr>
+        <w:trPr>
+          <w:tblHeader w:val="on"/>
+        </w:trPr>
+        <w:tc>
+          <w:tcPr/>
+          <w:p>
+            <w:pPr>
+              <w:pStyle w:val="Compact"/>
+            </w:pPr>
+            <w:r>
+              <w:t xml:space="preserve">Handler suffix</w:t>
+            </w:r>
+          </w:p>
+        </w:tc>
+        <w:tc>
+          <w:tcPr/>
+          <w:p>
+            <w:pPr>
+              <w:pStyle w:val="Compact"/>
+            </w:pPr>
+            <w:r>
+              <w:t xml:space="preserve">HTTP verb</w:t>
+            </w:r>
+          </w:p>
+        </w:tc>
+        <w:tc>
+          <w:tcPr/>
+          <w:p>
+            <w:pPr>
+              <w:pStyle w:val="Compact"/>
+            </w:pPr>
+            <w:r>
+              <w:t xml:space="preserve">Missing</w:t>
+            </w:r>
+            <w:r>
+              <w:t xml:space="preserve"> </w:t>
+            </w:r>
+            <w:r>
+              <w:rPr>
+                <w:rStyle w:val="VerbatimChar"/>
+              </w:rPr>
+              <w:t xml:space="preserve">return</w:t>
+            </w:r>
+            <w:r>
+              <w:t xml:space="preserve">s</w:t>
+            </w:r>
+          </w:p>
+        </w:tc>
+        <w:tc>
+          <w:tcPr/>
+          <w:p>
+            <w:pPr>
+              <w:pStyle w:val="Compact"/>
+            </w:pPr>
+            <w:r>
+              <w:t xml:space="preserve">Patched</w:t>
+            </w:r>
+          </w:p>
+        </w:tc>
+      </w:tr>
+      <w:tr>
+        <w:tc>
+          <w:tcPr/>
+          <w:p>
+            <w:pPr>
+              <w:pStyle w:val="Compact"/>
+            </w:pPr>
+            <w:r>
+              <w:rPr>
+                <w:rStyle w:val="VerbatimChar"/>
+              </w:rPr>
+              <w:t xml:space="preserve">SubscriptionIdPut</w:t>
+            </w:r>
+          </w:p>
+        </w:tc>
+        <w:tc>
+          <w:tcPr/>
+          <w:p>
+            <w:pPr>
+              <w:pStyle w:val="Compact"/>
+            </w:pPr>
+            <w:r>
+              <w:t xml:space="preserve">PUT</w:t>
+            </w:r>
+          </w:p>
+        </w:tc>
+        <w:tc>
+          <w:tcPr/>
+          <w:p>
+            <w:pPr>
+              <w:pStyle w:val="Compact"/>
+            </w:pPr>
+            <w:r>
+              <w:t xml:space="preserve">1</w:t>
+            </w:r>
+          </w:p>
+        </w:tc>
+        <w:tc>
+          <w:tcPr/>
+          <w:p>
+            <w:pPr>
+              <w:pStyle w:val="Compact"/>
+            </w:pPr>
+            <w:r>
+              <w:t xml:space="preserve">Full</w:t>
+            </w:r>
+          </w:p>
+        </w:tc>
+      </w:tr>
+      <w:tr>
+        <w:tc>
+          <w:tcPr/>
+          <w:p>
+            <w:pPr>
+              <w:pStyle w:val="Compact"/>
+            </w:pPr>
+            <w:r>
+              <w:rPr>
+                <w:rStyle w:val="VerbatimChar"/>
+              </w:rPr>
+              <w:t xml:space="preserve">SubscriptionIdGet</w:t>
+            </w:r>
+          </w:p>
+        </w:tc>
+        <w:tc>
+          <w:tcPr/>
+          <w:p>
+            <w:pPr>
+              <w:pStyle w:val="Compact"/>
+            </w:pPr>
+            <w:r>
+              <w:t xml:space="preserve">GET</w:t>
+            </w:r>
+          </w:p>
+        </w:tc>
+        <w:tc>
+          <w:tcPr/>
+          <w:p>
+            <w:pPr>
+              <w:pStyle w:val="Compact"/>
+            </w:pPr>
+            <w:r>
+              <w:t xml:space="preserve">1</w:t>
+            </w:r>
+          </w:p>
+        </w:tc>
+        <w:tc>
+          <w:tcPr/>
+          <w:p>
+            <w:pPr>
+              <w:pStyle w:val="Compact"/>
+            </w:pPr>
+            <w:r>
+              <w:t xml:space="preserve">Full</w:t>
+            </w:r>
+          </w:p>
+        </w:tc>
+      </w:tr>
+      <w:tr>
+        <w:tc>
+          <w:tcPr/>
+          <w:p>
+            <w:pPr>
+              <w:pStyle w:val="Compact"/>
+            </w:pPr>
+            <w:r>
+              <w:rPr>
+                <w:rStyle w:val="VerbatimChar"/>
+              </w:rPr>
+              <w:t xml:space="preserve">SubscriptionIdDelete</w:t>
+            </w:r>
+          </w:p>
+        </w:tc>
+        <w:tc>
+          <w:tcPr/>
+          <w:p>
+            <w:pPr>
+              <w:pStyle w:val="Compact"/>
+            </w:pPr>
+            <w:r>
+              <w:t xml:space="preserve">DELETE</w:t>
+            </w:r>
+          </w:p>
+        </w:tc>
+        <w:tc>
+          <w:tcPr/>
+          <w:p>
+            <w:pPr>
+              <w:pStyle w:val="Compact"/>
+            </w:pPr>
+            <w:r>
+              <w:t xml:space="preserve">1</w:t>
+            </w:r>
+          </w:p>
+        </w:tc>
+        <w:tc>
+          <w:tcPr/>
+          <w:p>
+            <w:pPr>
+              <w:pStyle w:val="Compact"/>
+            </w:pPr>
+            <w:r>
+              <w:t xml:space="preserve">Full</w:t>
+            </w:r>
+          </w:p>
+        </w:tc>
+      </w:tr>
+      <w:tr>
+        <w:tc>
+          <w:tcPr/>
+          <w:p>
+            <w:pPr>
+              <w:pStyle w:val="Compact"/>
+            </w:pPr>
+            <w:r>
+              <w:rPr>
+                <w:rStyle w:val="VerbatimChar"/>
+              </w:rPr>
+              <w:t xml:space="preserve">Get</w:t>
+            </w:r>
+            <w:r>
+              <w:t xml:space="preserve"> </w:t>
+            </w:r>
+            <w:r>
+              <w:t xml:space="preserve">(list)</w:t>
+            </w:r>
+          </w:p>
+        </w:tc>
+        <w:tc>
+          <w:tcPr/>
+          <w:p>
+            <w:pPr>
+              <w:pStyle w:val="Compact"/>
+            </w:pPr>
+            <w:r>
+              <w:t xml:space="preserve">GET</w:t>
+            </w:r>
+          </w:p>
+        </w:tc>
+        <w:tc>
+          <w:tcPr/>
+          <w:p>
+            <w:pPr>
+              <w:pStyle w:val="Compact"/>
+            </w:pPr>
+            <w:r>
+              <w:t xml:space="preserve">2</w:t>
+            </w:r>
+          </w:p>
+        </w:tc>
+        <w:tc>
+          <w:tcPr/>
+          <w:p>
+            <w:pPr>
+              <w:pStyle w:val="Compact"/>
+            </w:pPr>
+            <w:r>
+              <w:t xml:space="preserve">Partial (1/2)</w:t>
+            </w:r>
+          </w:p>
+        </w:tc>
+      </w:tr>
+    </w:tbl>
     <w:p>
       <w:pPr>
         <w:pStyle w:val="BodyText"/>

</xml_diff>

<commit_message>
Apply /human-writer rewrites to paper/main.docx
Rewrites three sections to remove AI-writing signals identified by
StoryScope (arXiv 2604.03136):

Abstract: cut self-framing "alongside its honest limits" narrator
commentary; ends with a concrete unresolved statement instead of
tidy forward-looking summary.

Contributions paragraph: replaced (i)/(ii)/(iii) parallel list with
prose; names the partial finding as a real problem rather than a
framed admission of honesty.

Conclusion: split single paragraph into three; removed acceptance
resolution ("a concrete, if narrow, step"); partial finding now
stated as a design constraint with technical specificity; final
sentence marks a location rather than making peace with limits.

Co-Authored-By: Claude Sonnet 4.6 <noreply@anthropic.com>
Claude-Session: https://claude.ai/code/session_01S5phdjCgmecexM654bTfrX
</commit_message>
<xml_diff>
--- a/paper/main.docx
+++ b/paper/main.docx
@@ -87,22 +87,7 @@
         <w:pStyle w:val="FirstParagraph"/>
       </w:pPr>
       <w:r>
-        <w:t xml:space="preserve">Automated vulnerability analysis tools are frequently evaluated against synthetic reproductions of security bugs rather than the real upstream codebases those bugs were disclosed in, which limits confidence that results transfer to practice. We present a case study applying AST-based reachability filtering and rule-based patch generation to a real, disclosed vulnerability (CVE-2026-40248, CWE-285) in free5GC’s Unified Data Repository (UDR), a component of a real, standards-compliant open-source 5G core network. Reachability analysis over the real ~86KB source file reduces 102 parsed functions to the 4 that are actually reachable from the vulnerable HTTP entry points, a 96.1% reduction in analysis scope. We generate a targeted patch for each reachable finding and, going beyond isolated-file compilation, verify the patch against a live clone of the actual</w:t>
-      </w:r>
-      <w:r>
-        <w:t xml:space="preserve"> </w:t>
-      </w:r>
-      <w:r>
-        <w:rPr>
-          <w:rStyle w:val="VerbatimChar"/>
-        </w:rPr>
-        <w:t xml:space="preserve">free5gc/udr</w:t>
-      </w:r>
-      <w:r>
-        <w:t xml:space="preserve"> </w:t>
-      </w:r>
-      <w:r>
-        <w:t xml:space="preserve">repository: applying all four generated patches preserves a clean build against the project’s real dependency graph. We report this result alongside its honest limits: compile verification is not runtime confirmation, and one of the four findings is only partially corrected by the rule-based patcher. We discuss what further verification against the live network function would require.</w:t>
+        <w:t xml:space="preserve">Automated vulnerability analysis tools are typically evaluated on synthetic reproductions of security bugs rather than the real upstream codebases where those bugs were found. Whether results obtained this way transfer to actual builds is a question the evaluations rarely address. We apply AST-based reachability filtering and rule-based patch generation to CVE-2026-40248 (CWE-285), a missing-return vulnerability in free5GC’s Unified Data Repository (UDR), a Go service in a real, standards-compliant open-source 5G core network. Parsing the real ∼86KB source file yields 102 functions; reachability analysis from the four UDR HTTP entry points retains 4, a 96.1 % reduction. We patch each reachable finding and verify the result not against an isolated file copy but against a live clone of the actual free5gc/udr repository: all four patches preserve a clean build against the project’s real dependency graph. One finding is only partially corrected — the rule-based patcher inserts the first missing return but does not handle the handler’s second conditional block. Compile-time verification is not runtime confirmation. Closing that gap requires the full free5GC deployment stack, which this paper does not attempt.</w:t>
       </w:r>
     </w:p>
     <w:bookmarkEnd w:id="9"/>
@@ -136,7 +121,7 @@
         <w:pStyle w:val="BodyText"/>
       </w:pPr>
       <w:r>
-        <w:t xml:space="preserve">Our contributions are: (i) an application of OpenAnt’s reachability-filtered decomposition methodology to a real free5GC source file against a real, disclosed CVE, with a 96.1% reduction in the functions requiring further analysis; (ii) automatically generated patches for all four reachable findings, verified to preserve a clean build of the real, live-cloned upstream project; and (iii) an honest accounting of what this does and does not establish, including a partially-corrected finding we report rather than omit.</w:t>
+        <w:t xml:space="preserve">We apply OpenAnt’s reachability-filtered decomposition to the actual ∼86KB UDR source file and reduce 102 functions to 4. We patch all four and verify each against a live clone of the real upstream project. One patch is partial: the handler needs two return insertions; the patcher finds the first and stops. We include that finding because omitting it would misrepresent what the pipeline achieves.</w:t>
       </w:r>
     </w:p>
     <w:bookmarkEnd w:id="10"/>
@@ -1059,7 +1044,23 @@
         <w:pStyle w:val="FirstParagraph"/>
       </w:pPr>
       <w:r>
-        <w:t xml:space="preserve">We presented a case study demonstrating that reachability-filtered static analysis and automated patch generation can be applied to a real, disclosed free5GC vulnerability with verification against the project’s actual upstream repository, not a synthetic reproduction. This reduced 102 real functions to the 4 that matter and confirmed generated patches for all 4 preserve a clean build of the live cloned project. We report this alongside its real limits: compile-time verification is not runtime confirmation, and one finding is only partially corrected by the current rule-based patcher. We see this as a concrete, if narrow, step toward evaluating automated vulnerability tooling against real 5G core network software rather than stand-ins built for the purpose.</w:t>
+        <w:t xml:space="preserve">We applied reachability-filtered triage and rule-based patch generation to CVE-2026-40248 and verified all four generated patches against the actual upstream free5GC build. The 96.1 % scope reduction follows directly from the call graph; all four patches compile cleanly.</w:t>
+      </w:r>
+    </w:p>
+    <w:p>
+      <w:pPr>
+        <w:pStyle w:val="FirstParagraph"/>
+      </w:pPr>
+      <w:r>
+        <w:t xml:space="preserve">One does not fully close the vulnerability. The handler contains two independent conditional blocks that both require return insertions; the patcher matches the first and exits, leaving the second uncorrected. That is a design constraint in the current implementation, not an edge case.</w:t>
+      </w:r>
+    </w:p>
+    <w:p>
+      <w:pPr>
+        <w:pStyle w:val="FirstParagraph"/>
+      </w:pPr>
+      <w:r>
+        <w:t xml:space="preserve">What the compile step does not establish is whether the vulnerability is actually closed at runtime. That requires the full free5GC stack — NRF registration, a running MongoDB instance, live traffic to the UDR endpoint. The distance between a clean build and a confirmed fix is not small. This paper covers the first half.</w:t>
       </w:r>
     </w:p>
     <w:bookmarkEnd w:id="20"/>

</xml_diff>